<commit_message>
ZshV2 publish without dual Charge
</commit_message>
<xml_diff>
--- a/core/update/package/使用说明.docx
+++ b/core/update/package/使用说明.docx
@@ -4,10 +4,67 @@
   <w:body>
     <w:p>
       <w:pPr>
+        <w:keepNext w:val="0"/>
+        <w:keepLines w:val="0"/>
+        <w:pageBreakBefore w:val="0"/>
+        <w:widowControl w:val="0"/>
+        <w:numPr>
+          <w:ilvl w:val="0"/>
+          <w:numId w:val="0"/>
+        </w:numPr>
+        <w:kinsoku/>
+        <w:wordWrap/>
+        <w:overflowPunct/>
+        <w:topLinePunct w:val="0"/>
+        <w:autoSpaceDE/>
+        <w:autoSpaceDN/>
+        <w:bidi w:val="0"/>
+        <w:adjustRightInd/>
+        <w:snapToGrid/>
+        <w:spacing w:line="360" w:lineRule="auto"/>
+        <w:textAlignment w:val="auto"/>
+        <w:rPr>
+          <w:rFonts w:hint="eastAsia" w:ascii="黑体" w:hAnsi="黑体" w:eastAsia="黑体" w:cs="黑体"/>
+          <w:b/>
+          <w:bCs/>
+          <w:sz w:val="24"/>
+          <w:szCs w:val="32"/>
+          <w:lang w:val="en-US" w:eastAsia="zh-CN"/>
+        </w:rPr>
+      </w:pPr>
+      <w:r>
+        <w:rPr>
+          <w:rFonts w:hint="eastAsia" w:ascii="黑体" w:hAnsi="黑体" w:eastAsia="黑体" w:cs="黑体"/>
+          <w:b/>
+          <w:bCs/>
+          <w:sz w:val="24"/>
+          <w:szCs w:val="32"/>
+          <w:lang w:val="en-US" w:eastAsia="zh-CN"/>
+        </w:rPr>
+        <w:t>全量包更新方式</w:t>
+      </w:r>
+    </w:p>
+    <w:p>
+      <w:pPr>
+        <w:keepNext w:val="0"/>
+        <w:keepLines w:val="0"/>
+        <w:pageBreakBefore w:val="0"/>
+        <w:widowControl w:val="0"/>
         <w:numPr>
           <w:ilvl w:val="0"/>
           <w:numId w:val="1"/>
         </w:numPr>
+        <w:kinsoku/>
+        <w:wordWrap/>
+        <w:overflowPunct/>
+        <w:topLinePunct w:val="0"/>
+        <w:autoSpaceDE/>
+        <w:autoSpaceDN/>
+        <w:bidi w:val="0"/>
+        <w:adjustRightInd/>
+        <w:snapToGrid/>
+        <w:spacing w:line="360" w:lineRule="auto"/>
+        <w:textAlignment w:val="auto"/>
         <w:rPr>
           <w:rFonts w:hint="default"/>
           <w:lang w:val="en-US" w:eastAsia="zh-CN"/>
@@ -30,11 +87,26 @@
     </w:p>
     <w:p>
       <w:pPr>
-        <w:numPr>
-          <w:ilvl w:val="0"/>
-          <w:numId w:val="0"/>
-        </w:numPr>
+        <w:keepNext w:val="0"/>
+        <w:keepLines w:val="0"/>
+        <w:pageBreakBefore w:val="0"/>
+        <w:widowControl w:val="0"/>
+        <w:numPr>
+          <w:ilvl w:val="0"/>
+          <w:numId w:val="0"/>
+        </w:numPr>
+        <w:kinsoku/>
+        <w:wordWrap/>
+        <w:overflowPunct/>
+        <w:topLinePunct w:val="0"/>
+        <w:autoSpaceDE/>
+        <w:autoSpaceDN/>
+        <w:bidi w:val="0"/>
+        <w:adjustRightInd/>
+        <w:snapToGrid/>
+        <w:spacing w:line="360" w:lineRule="auto"/>
         <w:ind w:firstLine="420" w:firstLineChars="0"/>
+        <w:textAlignment w:val="auto"/>
         <w:rPr>
           <w:rFonts w:hint="default"/>
           <w:lang w:val="en-US" w:eastAsia="zh-CN"/>
@@ -50,52 +122,86 @@
     </w:p>
     <w:p>
       <w:pPr>
-        <w:numPr>
-          <w:ilvl w:val="0"/>
-          <w:numId w:val="0"/>
-        </w:numPr>
-        <w:ind w:firstLine="420" w:firstLineChars="0"/>
+        <w:keepNext w:val="0"/>
+        <w:keepLines w:val="0"/>
+        <w:pageBreakBefore w:val="0"/>
+        <w:widowControl w:val="0"/>
+        <w:numPr>
+          <w:ilvl w:val="0"/>
+          <w:numId w:val="0"/>
+        </w:numPr>
+        <w:kinsoku/>
+        <w:wordWrap/>
+        <w:overflowPunct/>
+        <w:topLinePunct w:val="0"/>
+        <w:autoSpaceDE/>
+        <w:autoSpaceDN/>
+        <w:bidi w:val="0"/>
+        <w:adjustRightInd/>
+        <w:snapToGrid/>
+        <w:spacing w:line="360" w:lineRule="auto"/>
+        <w:textAlignment w:val="auto"/>
         <w:rPr>
           <w:rFonts w:hint="default"/>
           <w:lang w:val="en-US" w:eastAsia="zh-CN"/>
         </w:rPr>
       </w:pPr>
-    </w:p>
-    <w:p>
-      <w:pPr>
-        <w:numPr>
-          <w:ilvl w:val="0"/>
-          <w:numId w:val="0"/>
-        </w:numPr>
+      <w:r>
         <w:rPr>
           <w:rFonts w:hint="default"/>
           <w:lang w:val="en-US" w:eastAsia="zh-CN"/>
         </w:rPr>
-      </w:pPr>
-      <w:r>
+        <w:t>2.</w:t>
+      </w:r>
+      <w:r>
+        <w:rPr>
+          <w:rFonts w:hint="eastAsia"/>
+          <w:lang w:val="en-US" w:eastAsia="zh-CN"/>
+        </w:rPr>
+        <w:t>等待约半分钟后，使用winscp将安装程序放到目标控制器的‘/usr/app/config’目录下。</w:t>
+      </w:r>
+    </w:p>
+    <w:p>
+      <w:pPr>
+        <w:keepNext w:val="0"/>
+        <w:keepLines w:val="0"/>
+        <w:pageBreakBefore w:val="0"/>
+        <w:widowControl w:val="0"/>
+        <w:kinsoku/>
+        <w:wordWrap/>
+        <w:overflowPunct/>
+        <w:topLinePunct w:val="0"/>
+        <w:autoSpaceDE/>
+        <w:autoSpaceDN/>
+        <w:bidi w:val="0"/>
+        <w:adjustRightInd/>
+        <w:snapToGrid/>
+        <w:spacing w:line="360" w:lineRule="auto"/>
+        <w:textAlignment w:val="auto"/>
         <w:rPr>
           <w:rFonts w:hint="default"/>
           <w:lang w:val="en-US" w:eastAsia="zh-CN"/>
         </w:rPr>
-        <w:t>2.</w:t>
-      </w:r>
-      <w:r>
-        <w:rPr>
-          <w:rFonts w:hint="eastAsia"/>
-          <w:lang w:val="en-US" w:eastAsia="zh-CN"/>
-        </w:rPr>
-        <w:t>等待约半分钟后，使用winscp将安装程序放到目标控制器的‘/usr/app/config’目录下。</w:t>
-      </w:r>
-    </w:p>
-    <w:p>
-      <w:pPr>
-        <w:rPr>
-          <w:rFonts w:hint="default"/>
-          <w:lang w:val="en-US" w:eastAsia="zh-CN"/>
-        </w:rPr>
-      </w:pPr>
-    </w:p>
-    <w:p>
+      </w:pPr>
+    </w:p>
+    <w:p>
+      <w:pPr>
+        <w:keepNext w:val="0"/>
+        <w:keepLines w:val="0"/>
+        <w:pageBreakBefore w:val="0"/>
+        <w:widowControl w:val="0"/>
+        <w:kinsoku/>
+        <w:wordWrap/>
+        <w:overflowPunct/>
+        <w:topLinePunct w:val="0"/>
+        <w:autoSpaceDE/>
+        <w:autoSpaceDN/>
+        <w:bidi w:val="0"/>
+        <w:adjustRightInd/>
+        <w:snapToGrid/>
+        <w:spacing w:line="360" w:lineRule="auto"/>
+        <w:textAlignment w:val="auto"/>
+      </w:pPr>
       <w:r>
         <w:drawing>
           <wp:inline distT="0" distB="0" distL="114300" distR="114300">
@@ -183,14 +289,47 @@
         </w:drawing>
       </w:r>
     </w:p>
-    <w:p/>
-    <w:p>
-      <w:pPr>
-        <w:numPr>
-          <w:ilvl w:val="0"/>
-          <w:numId w:val="0"/>
-        </w:numPr>
+    <w:p>
+      <w:pPr>
+        <w:keepNext w:val="0"/>
+        <w:keepLines w:val="0"/>
+        <w:pageBreakBefore w:val="0"/>
+        <w:widowControl w:val="0"/>
+        <w:kinsoku/>
+        <w:wordWrap/>
+        <w:overflowPunct/>
+        <w:topLinePunct w:val="0"/>
+        <w:autoSpaceDE/>
+        <w:autoSpaceDN/>
+        <w:bidi w:val="0"/>
+        <w:adjustRightInd/>
+        <w:snapToGrid/>
+        <w:spacing w:line="360" w:lineRule="auto"/>
+        <w:textAlignment w:val="auto"/>
+      </w:pPr>
+    </w:p>
+    <w:p>
+      <w:pPr>
+        <w:keepNext w:val="0"/>
+        <w:keepLines w:val="0"/>
+        <w:pageBreakBefore w:val="0"/>
+        <w:widowControl w:val="0"/>
+        <w:numPr>
+          <w:ilvl w:val="0"/>
+          <w:numId w:val="0"/>
+        </w:numPr>
+        <w:kinsoku/>
+        <w:wordWrap/>
+        <w:overflowPunct/>
+        <w:topLinePunct w:val="0"/>
+        <w:autoSpaceDE/>
+        <w:autoSpaceDN/>
+        <w:bidi w:val="0"/>
+        <w:adjustRightInd/>
+        <w:snapToGrid/>
+        <w:spacing w:line="360" w:lineRule="auto"/>
         <w:ind w:leftChars="0"/>
+        <w:textAlignment w:val="auto"/>
         <w:rPr>
           <w:rFonts w:hint="eastAsia"/>
           <w:lang w:val="en-US" w:eastAsia="zh-CN"/>
@@ -206,11 +345,26 @@
     </w:p>
     <w:p>
       <w:pPr>
-        <w:numPr>
-          <w:ilvl w:val="0"/>
-          <w:numId w:val="0"/>
-        </w:numPr>
+        <w:keepNext w:val="0"/>
+        <w:keepLines w:val="0"/>
+        <w:pageBreakBefore w:val="0"/>
+        <w:widowControl w:val="0"/>
+        <w:numPr>
+          <w:ilvl w:val="0"/>
+          <w:numId w:val="0"/>
+        </w:numPr>
+        <w:kinsoku/>
+        <w:wordWrap/>
+        <w:overflowPunct/>
+        <w:topLinePunct w:val="0"/>
+        <w:autoSpaceDE/>
+        <w:autoSpaceDN/>
+        <w:bidi w:val="0"/>
+        <w:adjustRightInd/>
+        <w:snapToGrid/>
+        <w:spacing w:line="360" w:lineRule="auto"/>
         <w:ind w:leftChars="0" w:firstLine="420" w:firstLineChars="0"/>
+        <w:textAlignment w:val="auto"/>
         <w:rPr>
           <w:rFonts w:hint="eastAsia"/>
           <w:lang w:val="en-US" w:eastAsia="zh-CN"/>
@@ -226,13 +380,27 @@
     </w:p>
     <w:p>
       <w:pPr>
-        <w:widowControl w:val="0"/>
-        <w:numPr>
-          <w:ilvl w:val="0"/>
-          <w:numId w:val="0"/>
-        </w:numPr>
+        <w:keepNext w:val="0"/>
+        <w:keepLines w:val="0"/>
+        <w:pageBreakBefore w:val="0"/>
+        <w:widowControl w:val="0"/>
+        <w:numPr>
+          <w:ilvl w:val="0"/>
+          <w:numId w:val="0"/>
+        </w:numPr>
+        <w:kinsoku/>
+        <w:wordWrap/>
+        <w:overflowPunct/>
+        <w:topLinePunct w:val="0"/>
+        <w:autoSpaceDE/>
+        <w:autoSpaceDN/>
+        <w:bidi w:val="0"/>
+        <w:adjustRightInd/>
+        <w:snapToGrid/>
+        <w:spacing w:line="360" w:lineRule="auto"/>
         <w:ind w:firstLine="420" w:firstLineChars="0"/>
         <w:jc w:val="both"/>
+        <w:textAlignment w:val="auto"/>
         <w:rPr>
           <w:rFonts w:hint="eastAsia"/>
           <w:lang w:val="en-US" w:eastAsia="zh-CN"/>
@@ -248,26 +416,54 @@
     </w:p>
     <w:p>
       <w:pPr>
-        <w:widowControl w:val="0"/>
-        <w:numPr>
-          <w:ilvl w:val="0"/>
-          <w:numId w:val="0"/>
-        </w:numPr>
+        <w:keepNext w:val="0"/>
+        <w:keepLines w:val="0"/>
+        <w:pageBreakBefore w:val="0"/>
+        <w:widowControl w:val="0"/>
+        <w:numPr>
+          <w:ilvl w:val="0"/>
+          <w:numId w:val="0"/>
+        </w:numPr>
+        <w:kinsoku/>
+        <w:wordWrap/>
+        <w:overflowPunct/>
+        <w:topLinePunct w:val="0"/>
+        <w:autoSpaceDE/>
+        <w:autoSpaceDN/>
+        <w:bidi w:val="0"/>
+        <w:adjustRightInd/>
+        <w:snapToGrid/>
+        <w:spacing w:line="360" w:lineRule="auto"/>
         <w:jc w:val="both"/>
-        <w:rPr>
-          <w:rFonts w:hint="eastAsia"/>
-          <w:lang w:val="en-US" w:eastAsia="zh-CN"/>
-        </w:rPr>
-      </w:pPr>
-    </w:p>
-    <w:p>
-      <w:pPr>
+        <w:textAlignment w:val="auto"/>
+        <w:rPr>
+          <w:rFonts w:hint="eastAsia"/>
+          <w:lang w:val="en-US" w:eastAsia="zh-CN"/>
+        </w:rPr>
+      </w:pPr>
+    </w:p>
+    <w:p>
+      <w:pPr>
+        <w:keepNext w:val="0"/>
+        <w:keepLines w:val="0"/>
+        <w:pageBreakBefore w:val="0"/>
         <w:widowControl w:val="0"/>
         <w:numPr>
           <w:ilvl w:val="0"/>
           <w:numId w:val="2"/>
         </w:numPr>
+        <w:kinsoku/>
+        <w:wordWrap/>
+        <w:overflowPunct/>
+        <w:topLinePunct w:val="0"/>
+        <w:autoSpaceDE/>
+        <w:autoSpaceDN/>
+        <w:bidi w:val="0"/>
+        <w:adjustRightInd/>
+        <w:snapToGrid/>
+        <w:spacing w:line="360" w:lineRule="auto"/>
         <w:jc w:val="both"/>
+        <w:textAlignment w:val="auto"/>
         <w:rPr>
           <w:rFonts w:hint="eastAsia"/>
           <w:lang w:val="en-US" w:eastAsia="zh-CN"/>
@@ -283,12 +479,26 @@
     </w:p>
     <w:p>
       <w:pPr>
+        <w:keepNext w:val="0"/>
+        <w:keepLines w:val="0"/>
+        <w:pageBreakBefore w:val="0"/>
         <w:widowControl w:val="0"/>
         <w:numPr>
           <w:ilvl w:val="0"/>
           <w:numId w:val="2"/>
         </w:numPr>
+        <w:kinsoku/>
+        <w:wordWrap/>
+        <w:overflowPunct/>
+        <w:topLinePunct w:val="0"/>
+        <w:autoSpaceDE/>
+        <w:autoSpaceDN/>
+        <w:bidi w:val="0"/>
+        <w:adjustRightInd/>
+        <w:snapToGrid/>
+        <w:spacing w:line="360" w:lineRule="auto"/>
         <w:jc w:val="both"/>
+        <w:textAlignment w:val="auto"/>
         <w:rPr>
           <w:rFonts w:hint="default"/>
           <w:lang w:val="en-US" w:eastAsia="zh-CN"/>
@@ -299,17 +509,40 @@
           <w:rFonts w:hint="eastAsia"/>
           <w:lang w:val="en-US" w:eastAsia="zh-CN"/>
         </w:rPr>
-        <w:t>获取权限后，进入‘参数配置’页面，配置充电桩号、电表地址、桩密钥等参数，后点击确认按钮，约15秒后自动重启。</w:t>
-      </w:r>
-    </w:p>
-    <w:p>
-      <w:pPr>
-        <w:widowControl w:val="0"/>
-        <w:numPr>
-          <w:ilvl w:val="0"/>
-          <w:numId w:val="0"/>
-        </w:numPr>
+        <w:t>获取权限后，进入‘参数配置’页面，配置充电桩号、电表地址、桩密钥、电表波特率</w:t>
+      </w:r>
+      <w:bookmarkStart w:id="0" w:name="_GoBack"/>
+      <w:bookmarkEnd w:id="0"/>
+      <w:r>
+        <w:rPr>
+          <w:rFonts w:hint="eastAsia"/>
+          <w:lang w:val="en-US" w:eastAsia="zh-CN"/>
+        </w:rPr>
+        <w:t>等参数，后点击确认按钮，约15秒后自动重启。</w:t>
+      </w:r>
+    </w:p>
+    <w:p>
+      <w:pPr>
+        <w:keepNext w:val="0"/>
+        <w:keepLines w:val="0"/>
+        <w:pageBreakBefore w:val="0"/>
+        <w:widowControl w:val="0"/>
+        <w:numPr>
+          <w:ilvl w:val="0"/>
+          <w:numId w:val="0"/>
+        </w:numPr>
+        <w:kinsoku/>
+        <w:wordWrap/>
+        <w:overflowPunct/>
+        <w:topLinePunct w:val="0"/>
+        <w:autoSpaceDE/>
+        <w:autoSpaceDN/>
+        <w:bidi w:val="0"/>
+        <w:adjustRightInd/>
+        <w:snapToGrid/>
+        <w:spacing w:line="360" w:lineRule="auto"/>
         <w:jc w:val="both"/>
+        <w:textAlignment w:val="auto"/>
         <w:rPr>
           <w:rFonts w:hint="default"/>
           <w:lang w:val="en-US" w:eastAsia="zh-CN"/>
@@ -322,9 +555,9 @@
         </w:rPr>
         <w:drawing>
           <wp:inline distT="0" distB="0" distL="114300" distR="114300">
-            <wp:extent cx="4965065" cy="4391660"/>
-            <wp:effectExtent l="0" t="0" r="0" b="0"/>
-            <wp:docPr id="3" name="图片 3" descr="a02345ff2ad42d26eb54e84fa2bfce56"/>
+            <wp:extent cx="5264785" cy="3947160"/>
+            <wp:effectExtent l="0" t="0" r="18415" b="15240"/>
+            <wp:docPr id="6" name="图片 6" descr="102de69ab51319d73059467266bf5eca"/>
             <wp:cNvGraphicFramePr>
               <a:graphicFrameLocks xmlns:a="http://schemas.openxmlformats.org/drawingml/2006/main" noChangeAspect="1"/>
             </wp:cNvGraphicFramePr>
@@ -332,14 +565,13 @@
               <a:graphicData uri="http://schemas.openxmlformats.org/drawingml/2006/picture">
                 <pic:pic xmlns:pic="http://schemas.openxmlformats.org/drawingml/2006/picture">
                   <pic:nvPicPr>
-                    <pic:cNvPr id="3" name="图片 3" descr="a02345ff2ad42d26eb54e84fa2bfce56"/>
+                    <pic:cNvPr id="6" name="图片 6" descr="102de69ab51319d73059467266bf5eca"/>
                     <pic:cNvPicPr>
                       <a:picLocks noChangeAspect="1"/>
                     </pic:cNvPicPr>
                   </pic:nvPicPr>
                   <pic:blipFill>
                     <a:blip r:embed="rId6"/>
-                    <a:srcRect t="26653" b="23595"/>
                     <a:stretch>
                       <a:fillRect/>
                     </a:stretch>
@@ -347,7 +579,7 @@
                   <pic:spPr>
                     <a:xfrm>
                       <a:off x="0" y="0"/>
-                      <a:ext cx="4965065" cy="4391660"/>
+                      <a:ext cx="5264785" cy="3947160"/>
                     </a:xfrm>
                     <a:prstGeom prst="rect">
                       <a:avLst/>
@@ -362,12 +594,26 @@
     </w:p>
     <w:p>
       <w:pPr>
-        <w:widowControl w:val="0"/>
-        <w:numPr>
-          <w:ilvl w:val="0"/>
-          <w:numId w:val="0"/>
-        </w:numPr>
+        <w:keepNext w:val="0"/>
+        <w:keepLines w:val="0"/>
+        <w:pageBreakBefore w:val="0"/>
+        <w:widowControl w:val="0"/>
+        <w:numPr>
+          <w:ilvl w:val="0"/>
+          <w:numId w:val="0"/>
+        </w:numPr>
+        <w:kinsoku/>
+        <w:wordWrap/>
+        <w:overflowPunct/>
+        <w:topLinePunct w:val="0"/>
+        <w:autoSpaceDE/>
+        <w:autoSpaceDN/>
+        <w:bidi w:val="0"/>
+        <w:adjustRightInd/>
+        <w:snapToGrid/>
+        <w:spacing w:line="360" w:lineRule="auto"/>
         <w:jc w:val="both"/>
+        <w:textAlignment w:val="auto"/>
         <w:rPr>
           <w:rFonts w:hint="default"/>
           <w:lang w:val="en-US" w:eastAsia="zh-CN"/>
@@ -376,56 +622,292 @@
     </w:p>
     <w:p>
       <w:pPr>
-        <w:widowControl w:val="0"/>
-        <w:numPr>
-          <w:ilvl w:val="0"/>
-          <w:numId w:val="0"/>
-        </w:numPr>
+        <w:keepNext w:val="0"/>
+        <w:keepLines w:val="0"/>
+        <w:pageBreakBefore w:val="0"/>
+        <w:widowControl w:val="0"/>
+        <w:numPr>
+          <w:ilvl w:val="0"/>
+          <w:numId w:val="0"/>
+        </w:numPr>
+        <w:kinsoku/>
+        <w:wordWrap/>
+        <w:overflowPunct/>
+        <w:topLinePunct w:val="0"/>
+        <w:autoSpaceDE/>
+        <w:autoSpaceDN/>
+        <w:bidi w:val="0"/>
+        <w:adjustRightInd/>
+        <w:snapToGrid/>
+        <w:spacing w:line="360" w:lineRule="auto"/>
         <w:jc w:val="both"/>
-        <w:rPr>
-          <w:rFonts w:hint="eastAsia"/>
-          <w:lang w:val="en-US" w:eastAsia="zh-CN"/>
-        </w:rPr>
-      </w:pPr>
-      <w:r>
-        <w:rPr>
-          <w:rFonts w:hint="eastAsia"/>
-          <w:lang w:val="en-US" w:eastAsia="zh-CN"/>
-        </w:rPr>
-        <w:t>注意，目前平台app上显示是否离线的逻辑有问题，当充电桩屏幕显示上线后，如手机app仍为离线状态，则需手动插枪</w:t>
-      </w:r>
-      <w:bookmarkStart w:id="0" w:name="_GoBack"/>
-      <w:bookmarkEnd w:id="0"/>
-      <w:r>
-        <w:rPr>
-          <w:rFonts w:hint="eastAsia"/>
-          <w:lang w:val="en-US" w:eastAsia="zh-CN"/>
-        </w:rPr>
-        <w:t>一次，平台就会恢复正常状态。</w:t>
-      </w:r>
-    </w:p>
-    <w:p>
-      <w:pPr>
-        <w:widowControl w:val="0"/>
-        <w:numPr>
-          <w:ilvl w:val="0"/>
-          <w:numId w:val="0"/>
-        </w:numPr>
+        <w:textAlignment w:val="auto"/>
+        <w:rPr>
+          <w:rFonts w:hint="eastAsia"/>
+          <w:lang w:val="en-US" w:eastAsia="zh-CN"/>
+        </w:rPr>
+      </w:pPr>
+    </w:p>
+    <w:p>
+      <w:pPr>
+        <w:keepNext w:val="0"/>
+        <w:keepLines w:val="0"/>
+        <w:pageBreakBefore w:val="0"/>
+        <w:widowControl w:val="0"/>
+        <w:numPr>
+          <w:ilvl w:val="0"/>
+          <w:numId w:val="0"/>
+        </w:numPr>
+        <w:kinsoku/>
+        <w:wordWrap/>
+        <w:overflowPunct/>
+        <w:topLinePunct w:val="0"/>
+        <w:autoSpaceDE/>
+        <w:autoSpaceDN/>
+        <w:bidi w:val="0"/>
+        <w:adjustRightInd/>
+        <w:snapToGrid/>
+        <w:spacing w:line="360" w:lineRule="auto"/>
+        <w:textAlignment w:val="auto"/>
+        <w:rPr>
+          <w:rFonts w:hint="eastAsia" w:ascii="黑体" w:hAnsi="黑体" w:eastAsia="黑体" w:cs="黑体"/>
+          <w:b/>
+          <w:bCs/>
+          <w:sz w:val="24"/>
+          <w:szCs w:val="32"/>
+          <w:lang w:val="en-US" w:eastAsia="zh-CN"/>
+        </w:rPr>
+      </w:pPr>
+      <w:r>
+        <w:rPr>
+          <w:rFonts w:hint="eastAsia" w:ascii="黑体" w:hAnsi="黑体" w:eastAsia="黑体" w:cs="黑体"/>
+          <w:b/>
+          <w:bCs/>
+          <w:sz w:val="24"/>
+          <w:szCs w:val="32"/>
+          <w:lang w:val="en-US" w:eastAsia="zh-CN"/>
+        </w:rPr>
+        <w:t>增量包更新方式</w:t>
+      </w:r>
+    </w:p>
+    <w:p>
+      <w:pPr>
+        <w:keepNext w:val="0"/>
+        <w:keepLines w:val="0"/>
+        <w:pageBreakBefore w:val="0"/>
+        <w:widowControl w:val="0"/>
+        <w:numPr>
+          <w:ilvl w:val="0"/>
+          <w:numId w:val="0"/>
+        </w:numPr>
+        <w:kinsoku/>
+        <w:wordWrap/>
+        <w:overflowPunct/>
+        <w:topLinePunct w:val="0"/>
+        <w:autoSpaceDE/>
+        <w:autoSpaceDN/>
+        <w:bidi w:val="0"/>
+        <w:adjustRightInd/>
+        <w:snapToGrid/>
+        <w:spacing w:line="360" w:lineRule="auto"/>
         <w:jc w:val="both"/>
-        <w:rPr>
-          <w:rFonts w:hint="eastAsia"/>
-          <w:lang w:val="en-US" w:eastAsia="zh-CN"/>
-        </w:rPr>
-      </w:pPr>
-    </w:p>
-    <w:p>
-      <w:pPr>
-        <w:widowControl w:val="0"/>
-        <w:numPr>
-          <w:ilvl w:val="0"/>
-          <w:numId w:val="0"/>
-        </w:numPr>
+        <w:textAlignment w:val="auto"/>
+        <w:rPr>
+          <w:rFonts w:hint="default"/>
+          <w:lang w:val="en-US" w:eastAsia="zh-CN"/>
+        </w:rPr>
+      </w:pPr>
+      <w:r>
+        <w:rPr>
+          <w:rFonts w:hint="eastAsia"/>
+          <w:lang w:val="en-US" w:eastAsia="zh-CN"/>
+        </w:rPr>
+        <w:t>1.将install</w:t>
+      </w:r>
+      <w:r>
+        <w:rPr>
+          <w:rFonts w:hint="default"/>
+          <w:lang w:val="en-US" w:eastAsia="zh-CN"/>
+        </w:rPr>
+        <w:t>.tar.gz</w:t>
+      </w:r>
+      <w:r>
+        <w:rPr>
+          <w:rFonts w:hint="eastAsia"/>
+          <w:lang w:val="en-US" w:eastAsia="zh-CN"/>
+        </w:rPr>
+        <w:t>放到u盘中使用左下角“关于”页中的u盘升级功能升级。保留之前的配置文件。</w:t>
+      </w:r>
+    </w:p>
+    <w:p>
+      <w:pPr>
+        <w:keepNext w:val="0"/>
+        <w:keepLines w:val="0"/>
+        <w:pageBreakBefore w:val="0"/>
+        <w:widowControl w:val="0"/>
+        <w:numPr>
+          <w:ilvl w:val="0"/>
+          <w:numId w:val="0"/>
+        </w:numPr>
+        <w:kinsoku/>
+        <w:wordWrap/>
+        <w:overflowPunct/>
+        <w:topLinePunct w:val="0"/>
+        <w:autoSpaceDE/>
+        <w:autoSpaceDN/>
+        <w:bidi w:val="0"/>
+        <w:adjustRightInd/>
+        <w:snapToGrid/>
+        <w:spacing w:line="360" w:lineRule="auto"/>
         <w:jc w:val="both"/>
+        <w:textAlignment w:val="auto"/>
+        <w:rPr>
+          <w:rFonts w:hint="eastAsia"/>
+          <w:lang w:val="en-US" w:eastAsia="zh-CN"/>
+        </w:rPr>
+      </w:pPr>
+    </w:p>
+    <w:p>
+      <w:pPr>
+        <w:keepNext w:val="0"/>
+        <w:keepLines w:val="0"/>
+        <w:pageBreakBefore w:val="0"/>
+        <w:widowControl w:val="0"/>
+        <w:numPr>
+          <w:ilvl w:val="0"/>
+          <w:numId w:val="0"/>
+        </w:numPr>
+        <w:kinsoku/>
+        <w:wordWrap/>
+        <w:overflowPunct/>
+        <w:topLinePunct w:val="0"/>
+        <w:autoSpaceDE/>
+        <w:autoSpaceDN/>
+        <w:bidi w:val="0"/>
+        <w:adjustRightInd/>
+        <w:snapToGrid/>
+        <w:spacing w:line="360" w:lineRule="auto"/>
+        <w:jc w:val="both"/>
+        <w:textAlignment w:val="auto"/>
+        <w:rPr>
+          <w:rFonts w:hint="eastAsia"/>
+          <w:lang w:val="en-US" w:eastAsia="zh-CN"/>
+        </w:rPr>
+      </w:pPr>
+    </w:p>
+    <w:p>
+      <w:pPr>
+        <w:keepNext w:val="0"/>
+        <w:keepLines w:val="0"/>
+        <w:pageBreakBefore w:val="0"/>
+        <w:widowControl w:val="0"/>
+        <w:numPr>
+          <w:ilvl w:val="0"/>
+          <w:numId w:val="0"/>
+        </w:numPr>
+        <w:kinsoku/>
+        <w:wordWrap/>
+        <w:overflowPunct/>
+        <w:topLinePunct w:val="0"/>
+        <w:autoSpaceDE/>
+        <w:autoSpaceDN/>
+        <w:bidi w:val="0"/>
+        <w:adjustRightInd/>
+        <w:snapToGrid/>
+        <w:spacing w:line="360" w:lineRule="auto"/>
+        <w:jc w:val="both"/>
+        <w:textAlignment w:val="auto"/>
+        <w:rPr>
+          <w:rFonts w:hint="eastAsia"/>
+          <w:lang w:val="en-US" w:eastAsia="zh-CN"/>
+        </w:rPr>
+      </w:pPr>
+    </w:p>
+    <w:p>
+      <w:pPr>
+        <w:keepNext w:val="0"/>
+        <w:keepLines w:val="0"/>
+        <w:pageBreakBefore w:val="0"/>
+        <w:widowControl w:val="0"/>
+        <w:numPr>
+          <w:ilvl w:val="0"/>
+          <w:numId w:val="0"/>
+        </w:numPr>
+        <w:kinsoku/>
+        <w:wordWrap/>
+        <w:overflowPunct/>
+        <w:topLinePunct w:val="0"/>
+        <w:autoSpaceDE/>
+        <w:autoSpaceDN/>
+        <w:bidi w:val="0"/>
+        <w:adjustRightInd/>
+        <w:snapToGrid/>
+        <w:spacing w:line="360" w:lineRule="auto"/>
+        <w:jc w:val="both"/>
+        <w:textAlignment w:val="auto"/>
+        <w:rPr>
+          <w:rFonts w:hint="eastAsia"/>
+          <w:lang w:val="en-US" w:eastAsia="zh-CN"/>
+        </w:rPr>
+      </w:pPr>
+    </w:p>
+    <w:p>
+      <w:pPr>
+        <w:keepNext w:val="0"/>
+        <w:keepLines w:val="0"/>
+        <w:pageBreakBefore w:val="0"/>
+        <w:widowControl w:val="0"/>
+        <w:numPr>
+          <w:ilvl w:val="0"/>
+          <w:numId w:val="0"/>
+        </w:numPr>
+        <w:kinsoku/>
+        <w:wordWrap/>
+        <w:overflowPunct/>
+        <w:topLinePunct w:val="0"/>
+        <w:autoSpaceDE/>
+        <w:autoSpaceDN/>
+        <w:bidi w:val="0"/>
+        <w:adjustRightInd/>
+        <w:snapToGrid/>
+        <w:spacing w:line="360" w:lineRule="auto"/>
+        <w:jc w:val="both"/>
+        <w:textAlignment w:val="auto"/>
+        <w:rPr>
+          <w:rFonts w:hint="eastAsia"/>
+          <w:lang w:val="en-US" w:eastAsia="zh-CN"/>
+        </w:rPr>
+      </w:pPr>
+      <w:r>
+        <w:rPr>
+          <w:rFonts w:hint="eastAsia"/>
+          <w:lang w:val="en-US" w:eastAsia="zh-CN"/>
+        </w:rPr>
+        <w:t>其他：</w:t>
+      </w:r>
+    </w:p>
+    <w:p>
+      <w:pPr>
+        <w:keepNext w:val="0"/>
+        <w:keepLines w:val="0"/>
+        <w:pageBreakBefore w:val="0"/>
+        <w:widowControl w:val="0"/>
+        <w:numPr>
+          <w:ilvl w:val="0"/>
+          <w:numId w:val="0"/>
+        </w:numPr>
+        <w:kinsoku/>
+        <w:wordWrap/>
+        <w:overflowPunct/>
+        <w:topLinePunct w:val="0"/>
+        <w:autoSpaceDE/>
+        <w:autoSpaceDN/>
+        <w:bidi w:val="0"/>
+        <w:adjustRightInd/>
+        <w:snapToGrid/>
+        <w:spacing w:line="360" w:lineRule="auto"/>
+        <w:jc w:val="both"/>
+        <w:textAlignment w:val="auto"/>
         <w:rPr>
           <w:rFonts w:hint="eastAsia"/>
           <w:lang w:val="en-US" w:eastAsia="zh-CN"/>
@@ -455,12 +937,26 @@
     </w:p>
     <w:p>
       <w:pPr>
-        <w:widowControl w:val="0"/>
-        <w:numPr>
-          <w:ilvl w:val="0"/>
-          <w:numId w:val="0"/>
-        </w:numPr>
+        <w:keepNext w:val="0"/>
+        <w:keepLines w:val="0"/>
+        <w:pageBreakBefore w:val="0"/>
+        <w:widowControl w:val="0"/>
+        <w:numPr>
+          <w:ilvl w:val="0"/>
+          <w:numId w:val="0"/>
+        </w:numPr>
+        <w:kinsoku/>
+        <w:wordWrap/>
+        <w:overflowPunct/>
+        <w:topLinePunct w:val="0"/>
+        <w:autoSpaceDE/>
+        <w:autoSpaceDN/>
+        <w:bidi w:val="0"/>
+        <w:adjustRightInd/>
+        <w:snapToGrid/>
+        <w:spacing w:line="360" w:lineRule="auto"/>
         <w:jc w:val="both"/>
+        <w:textAlignment w:val="auto"/>
         <w:rPr>
           <w:rFonts w:hint="default"/>
           <w:lang w:val="en-US" w:eastAsia="zh-CN"/>

</xml_diff>

<commit_message>
Sync current project snapshot
</commit_message>
<xml_diff>
--- a/core/update/package/使用说明.docx
+++ b/core/update/package/使用说明.docx
@@ -509,16 +509,7 @@
           <w:rFonts w:hint="eastAsia"/>
           <w:lang w:val="en-US" w:eastAsia="zh-CN"/>
         </w:rPr>
-        <w:t>获取权限后，进入‘参数配置’页面，配置充电桩号、电表地址、桩密钥、电表波特率</w:t>
-      </w:r>
-      <w:bookmarkStart w:id="0" w:name="_GoBack"/>
-      <w:bookmarkEnd w:id="0"/>
-      <w:r>
-        <w:rPr>
-          <w:rFonts w:hint="eastAsia"/>
-          <w:lang w:val="en-US" w:eastAsia="zh-CN"/>
-        </w:rPr>
-        <w:t>等参数，后点击确认按钮，约15秒后自动重启。</w:t>
+        <w:t>获取权限后，进入‘参数配置’页面，配置充电桩号、电表地址、桩密钥、电表波特率等参数，后点击确认按钮，约15秒后自动重启。</w:t>
       </w:r>
     </w:p>
     <w:p>
@@ -850,6 +841,8 @@
           <w:lang w:val="en-US" w:eastAsia="zh-CN"/>
         </w:rPr>
       </w:pPr>
+      <w:bookmarkStart w:id="0" w:name="_GoBack"/>
+      <w:bookmarkEnd w:id="0"/>
     </w:p>
     <w:p>
       <w:pPr>
@@ -878,6 +871,62 @@
           <w:lang w:val="en-US" w:eastAsia="zh-CN"/>
         </w:rPr>
       </w:pPr>
+    </w:p>
+    <w:p>
+      <w:pPr>
+        <w:keepNext w:val="0"/>
+        <w:keepLines w:val="0"/>
+        <w:pageBreakBefore w:val="0"/>
+        <w:widowControl w:val="0"/>
+        <w:numPr>
+          <w:ilvl w:val="0"/>
+          <w:numId w:val="0"/>
+        </w:numPr>
+        <w:kinsoku/>
+        <w:wordWrap/>
+        <w:overflowPunct/>
+        <w:topLinePunct w:val="0"/>
+        <w:autoSpaceDE/>
+        <w:autoSpaceDN/>
+        <w:bidi w:val="0"/>
+        <w:adjustRightInd/>
+        <w:snapToGrid/>
+        <w:spacing w:line="360" w:lineRule="auto"/>
+        <w:jc w:val="both"/>
+        <w:textAlignment w:val="auto"/>
+        <w:rPr>
+          <w:rFonts w:hint="eastAsia"/>
+          <w:lang w:val="en-US" w:eastAsia="zh-CN"/>
+        </w:rPr>
+      </w:pPr>
+    </w:p>
+    <w:p>
+      <w:pPr>
+        <w:keepNext w:val="0"/>
+        <w:keepLines w:val="0"/>
+        <w:pageBreakBefore w:val="0"/>
+        <w:widowControl w:val="0"/>
+        <w:numPr>
+          <w:ilvl w:val="0"/>
+          <w:numId w:val="0"/>
+        </w:numPr>
+        <w:kinsoku/>
+        <w:wordWrap/>
+        <w:overflowPunct/>
+        <w:topLinePunct w:val="0"/>
+        <w:autoSpaceDE/>
+        <w:autoSpaceDN/>
+        <w:bidi w:val="0"/>
+        <w:adjustRightInd/>
+        <w:snapToGrid/>
+        <w:spacing w:line="360" w:lineRule="auto"/>
+        <w:jc w:val="both"/>
+        <w:textAlignment w:val="auto"/>
+        <w:rPr>
+          <w:rFonts w:hint="eastAsia"/>
+          <w:lang w:val="en-US" w:eastAsia="zh-CN"/>
+        </w:rPr>
+      </w:pPr>
       <w:r>
         <w:rPr>
           <w:rFonts w:hint="eastAsia"/>
@@ -918,7 +967,7 @@
           <w:rFonts w:hint="eastAsia"/>
           <w:lang w:val="en-US" w:eastAsia="zh-CN"/>
         </w:rPr>
-        <w:t>对于需要开启“即插即充”功能的场站，需要修改A控上层板中“/usr/app/config”内的“tcu</w:t>
+        <w:t>对于需要开启“即插即充”、“合并充电”、“广东现场语音播报”功能的场站，需要修改A控上层板中“/usr/app/config”内的“tcu</w:t>
       </w:r>
       <w:r>
         <w:rPr>
@@ -965,9 +1014,9 @@
       <w:r>
         <w:drawing>
           <wp:inline distT="0" distB="0" distL="114300" distR="114300">
-            <wp:extent cx="5271770" cy="2738755"/>
-            <wp:effectExtent l="0" t="0" r="11430" b="4445"/>
-            <wp:docPr id="4" name="图片 1"/>
+            <wp:extent cx="5274310" cy="6122035"/>
+            <wp:effectExtent l="0" t="0" r="8890" b="24765"/>
+            <wp:docPr id="3" name="图片 1"/>
             <wp:cNvGraphicFramePr>
               <a:graphicFrameLocks xmlns:a="http://schemas.openxmlformats.org/drawingml/2006/main" noChangeAspect="1"/>
             </wp:cNvGraphicFramePr>
@@ -975,7 +1024,7 @@
               <a:graphicData uri="http://schemas.openxmlformats.org/drawingml/2006/picture">
                 <pic:pic xmlns:pic="http://schemas.openxmlformats.org/drawingml/2006/picture">
                   <pic:nvPicPr>
-                    <pic:cNvPr id="4" name="图片 1"/>
+                    <pic:cNvPr id="3" name="图片 1"/>
                     <pic:cNvPicPr>
                       <a:picLocks noChangeAspect="1"/>
                     </pic:cNvPicPr>
@@ -989,7 +1038,7 @@
                   <pic:spPr>
                     <a:xfrm>
                       <a:off x="0" y="0"/>
-                      <a:ext cx="5271770" cy="2738755"/>
+                      <a:ext cx="5274310" cy="6122035"/>
                     </a:xfrm>
                     <a:prstGeom prst="rect">
                       <a:avLst/>

</xml_diff>